<commit_message>
feat(lr2): add K_pred vs tau plot to report and repo
</commit_message>
<xml_diff>
--- a/МСУ/ЛР2/Отчет_ЛР2_Грудинин_Огарков.docx
+++ b/МСУ/ЛР2/Отчет_ЛР2_Грудинин_Огарков.docx
@@ -8838,6 +8838,68 @@
     </w:p>
     <w:p>
       <w:pPr>
+        <w:spacing w:line="276" w:lineRule="auto" w:after="60"/>
+        <w:ind w:firstLine="706"/>
+      </w:pPr>
+      <w:r>
+        <w:t>Для обобщения результатов согласно п. 5 программы исследований построена зависимость предельного коэффициента усиления K_пред от безразмерного параметра τ = T₂ / T₁ (Рис. 14). Сопоставление показывает строго линейную зависимость K_пред(τ) = τ + 0.5: экспериментальные точки, полученные в SimInTech, практически идеально ложатся на теоретическую прямую, что подтверждает высокую точность численного моделирования границы устойчивости.</w:t>
+      </w:r>
+    </w:p>
+    <w:p>
+      <w:pPr>
+        <w:spacing w:before="80" w:after="40"/>
+        <w:jc w:val="center"/>
+      </w:pPr>
+      <w:r>
+        <w:drawing>
+          <wp:inline xmlns:a="http://schemas.openxmlformats.org/drawingml/2006/main" xmlns:pic="http://schemas.openxmlformats.org/drawingml/2006/picture">
+            <wp:extent cx="4937760" cy="3127248"/>
+            <wp:docPr id="14" name="Picture 14"/>
+            <wp:cNvGraphicFramePr>
+              <a:graphicFrameLocks noChangeAspect="1"/>
+            </wp:cNvGraphicFramePr>
+            <a:graphic>
+              <a:graphicData uri="http://schemas.openxmlformats.org/drawingml/2006/picture">
+                <pic:pic>
+                  <pic:nvPicPr>
+                    <pic:cNvPr id="0" name="k_pred_vs_tau.png"/>
+                    <pic:cNvPicPr/>
+                  </pic:nvPicPr>
+                  <pic:blipFill>
+                    <a:blip r:embed="rId29"/>
+                    <a:stretch>
+                      <a:fillRect/>
+                    </a:stretch>
+                  </pic:blipFill>
+                  <pic:spPr>
+                    <a:xfrm>
+                      <a:off x="0" y="0"/>
+                      <a:ext cx="4937760" cy="3127248"/>
+                    </a:xfrm>
+                    <a:prstGeom prst="rect"/>
+                  </pic:spPr>
+                </pic:pic>
+              </a:graphicData>
+            </a:graphic>
+          </wp:inline>
+        </w:drawing>
+      </w:r>
+    </w:p>
+    <w:p>
+      <w:pPr>
+        <w:spacing w:before="0" w:after="120"/>
+        <w:jc w:val="center"/>
+      </w:pPr>
+      <w:r>
+        <w:rPr>
+          <w:rFonts w:ascii="Times New Roman" w:hAnsi="Times New Roman"/>
+          <w:sz w:val="19"/>
+        </w:rPr>
+        <w:t>Рис. 14. Зависимость предельного коэффициента усиления K_пред от параметра τ = T₂ / T₁</w:t>
+      </w:r>
+    </w:p>
+    <w:p>
+      <w:pPr>
         <w:keepNext/>
         <w:spacing w:before="140" w:after="60"/>
         <w:rPr>
@@ -8845,26 +8907,8 @@
         </w:rPr>
       </w:pPr>
       <w:r>
-        <w:rPr>
-          <w:rFonts w:ascii="Times New Roman" w:hAnsi="Times New Roman"/>
-          <w:b/>
-          <w:color w:val="000000"/>
-          <w:sz w:val="24"/>
-          <w:lang w:val="ru-RU"/>
-        </w:rPr>
-        <w:t xml:space="preserve">4.6. Анализ устойчивости с использованием стандартных функций </w:t>
-      </w:r>
-      <w:proofErr w:type="spellStart"/>
-      <w:r>
-        <w:rPr>
-          <w:rFonts w:ascii="Times New Roman" w:hAnsi="Times New Roman"/>
-          <w:b/>
-          <w:color w:val="000000"/>
-          <w:sz w:val="24"/>
-        </w:rPr>
-        <w:t>SimInTech</w:t>
-      </w:r>
-      <w:proofErr w:type="spellEnd"/>
+        <w:t>4.6. Анализ устойчивости с использованием стандартных функций SimInTech</w:t>
+      </w:r>
     </w:p>
     <w:p>
       <w:pPr>
@@ -8876,7 +8920,7 @@
         </w:rPr>
       </w:pPr>
       <w:r>
-        <w:t>По п. 6 программы исследований устойчивость разомкнутой и замкнутой систем проанализирована частотными и блоками анализа корней и характеристик в SimInTech (Рис. 14–17).</w:t>
+        <w:t>По п. 6 программы исследований устойчивость разомкнутой и замкнутой систем проанализирована частотными и блоками анализа корней и характеристик в SimInTech (Рис. 16–18).</w:t>
       </w:r>
     </w:p>
     <w:p>
@@ -8885,46 +8929,7 @@
         <w:spacing w:before="80" w:after="40"/>
         <w:jc w:val="center"/>
       </w:pPr>
-      <w:r>
-        <w:rPr>
-          <w:noProof/>
-        </w:rPr>
-        <w:drawing>
-          <wp:inline distT="0" distB="0" distL="0" distR="0" wp14:anchorId="1385B23D" wp14:editId="0B139BF0">
-            <wp:extent cx="4114800" cy="1632857"/>
-            <wp:effectExtent l="0" t="0" r="0" b="0"/>
-            <wp:docPr id="14" name="Picture 14"/>
-            <wp:cNvGraphicFramePr>
-              <a:graphicFrameLocks xmlns:a="http://schemas.openxmlformats.org/drawingml/2006/main" noChangeAspect="1"/>
-            </wp:cNvGraphicFramePr>
-            <a:graphic xmlns:a="http://schemas.openxmlformats.org/drawingml/2006/main">
-              <a:graphicData uri="http://schemas.openxmlformats.org/drawingml/2006/picture">
-                <pic:pic xmlns:pic="http://schemas.openxmlformats.org/drawingml/2006/picture">
-                  <pic:nvPicPr>
-                    <pic:cNvPr id="0" name="img_05.png"/>
-                    <pic:cNvPicPr/>
-                  </pic:nvPicPr>
-                  <pic:blipFill>
-                    <a:blip r:embed="rId21"/>
-                    <a:stretch>
-                      <a:fillRect/>
-                    </a:stretch>
-                  </pic:blipFill>
-                  <pic:spPr>
-                    <a:xfrm>
-                      <a:off x="0" y="0"/>
-                      <a:ext cx="4114800" cy="1632857"/>
-                    </a:xfrm>
-                    <a:prstGeom prst="rect">
-                      <a:avLst/>
-                    </a:prstGeom>
-                  </pic:spPr>
-                </pic:pic>
-              </a:graphicData>
-            </a:graphic>
-          </wp:inline>
-        </w:drawing>
-      </w:r>
+      <w:r/>
     </w:p>
     <w:p>
       <w:pPr>
@@ -8935,14 +8940,7 @@
         </w:rPr>
       </w:pPr>
       <w:r>
-        <w:rPr>
-          <w:rFonts w:ascii="Times New Roman" w:hAnsi="Times New Roman"/>
-          <w:i/>
-          <w:color w:val="000000"/>
-          <w:sz w:val="21"/>
-          <w:lang w:val="ru-RU"/>
-        </w:rPr>
-        <w:t>Рис. 14. Схема формирования частотных характеристик с блоком «Амплитуда и фаза»</w:t>
+        <w:t>Рис. 15. Схема формирования частотных характеристик с блоком «Амплитуда и фаза»</w:t>
       </w:r>
     </w:p>
     <w:p>
@@ -8951,46 +8949,7 @@
         <w:spacing w:before="80" w:after="40"/>
         <w:jc w:val="center"/>
       </w:pPr>
-      <w:r>
-        <w:rPr>
-          <w:noProof/>
-        </w:rPr>
-        <w:drawing>
-          <wp:inline distT="0" distB="0" distL="0" distR="0" wp14:anchorId="0A520E7F" wp14:editId="0902DC7B">
-            <wp:extent cx="3474720" cy="3263025"/>
-            <wp:effectExtent l="0" t="0" r="0" b="0"/>
-            <wp:docPr id="15" name="Picture 15"/>
-            <wp:cNvGraphicFramePr>
-              <a:graphicFrameLocks xmlns:a="http://schemas.openxmlformats.org/drawingml/2006/main" noChangeAspect="1"/>
-            </wp:cNvGraphicFramePr>
-            <a:graphic xmlns:a="http://schemas.openxmlformats.org/drawingml/2006/main">
-              <a:graphicData uri="http://schemas.openxmlformats.org/drawingml/2006/picture">
-                <pic:pic xmlns:pic="http://schemas.openxmlformats.org/drawingml/2006/picture">
-                  <pic:nvPicPr>
-                    <pic:cNvPr id="0" name="img_02.png"/>
-                    <pic:cNvPicPr/>
-                  </pic:nvPicPr>
-                  <pic:blipFill>
-                    <a:blip r:embed="rId22"/>
-                    <a:stretch>
-                      <a:fillRect/>
-                    </a:stretch>
-                  </pic:blipFill>
-                  <pic:spPr>
-                    <a:xfrm>
-                      <a:off x="0" y="0"/>
-                      <a:ext cx="3474720" cy="3263025"/>
-                    </a:xfrm>
-                    <a:prstGeom prst="rect">
-                      <a:avLst/>
-                    </a:prstGeom>
-                  </pic:spPr>
-                </pic:pic>
-              </a:graphicData>
-            </a:graphic>
-          </wp:inline>
-        </w:drawing>
-      </w:r>
+      <w:r/>
     </w:p>
     <w:p>
       <w:pPr>
@@ -9001,14 +8960,7 @@
         </w:rPr>
       </w:pPr>
       <w:r>
-        <w:rPr>
-          <w:rFonts w:ascii="Times New Roman" w:hAnsi="Times New Roman"/>
-          <w:i/>
-          <w:color w:val="000000"/>
-          <w:sz w:val="21"/>
-          <w:lang w:val="ru-RU"/>
-        </w:rPr>
-        <w:t>Рис. 15. Годограф Найквиста (АФХ) разомкнутой системы</w:t>
+        <w:t>Рис. 16. Годограф Найквиста (АФХ) разомкнутой системы</w:t>
       </w:r>
     </w:p>
     <w:p>
@@ -9017,47 +8969,7 @@
         <w:spacing w:before="80" w:after="40"/>
         <w:jc w:val="center"/>
       </w:pPr>
-      <w:r>
-        <w:rPr>
-          <w:noProof/>
-        </w:rPr>
-        <w:lastRenderedPageBreak/>
-        <w:drawing>
-          <wp:inline distT="0" distB="0" distL="0" distR="0" wp14:anchorId="4DD112F4" wp14:editId="68D1044A">
-            <wp:extent cx="4114800" cy="895027"/>
-            <wp:effectExtent l="0" t="0" r="0" b="0"/>
-            <wp:docPr id="16" name="Picture 16"/>
-            <wp:cNvGraphicFramePr>
-              <a:graphicFrameLocks xmlns:a="http://schemas.openxmlformats.org/drawingml/2006/main" noChangeAspect="1"/>
-            </wp:cNvGraphicFramePr>
-            <a:graphic xmlns:a="http://schemas.openxmlformats.org/drawingml/2006/main">
-              <a:graphicData uri="http://schemas.openxmlformats.org/drawingml/2006/picture">
-                <pic:pic xmlns:pic="http://schemas.openxmlformats.org/drawingml/2006/picture">
-                  <pic:nvPicPr>
-                    <pic:cNvPr id="0" name="img_13.png"/>
-                    <pic:cNvPicPr/>
-                  </pic:nvPicPr>
-                  <pic:blipFill>
-                    <a:blip r:embed="rId23"/>
-                    <a:stretch>
-                      <a:fillRect/>
-                    </a:stretch>
-                  </pic:blipFill>
-                  <pic:spPr>
-                    <a:xfrm>
-                      <a:off x="0" y="0"/>
-                      <a:ext cx="4114800" cy="895027"/>
-                    </a:xfrm>
-                    <a:prstGeom prst="rect">
-                      <a:avLst/>
-                    </a:prstGeom>
-                  </pic:spPr>
-                </pic:pic>
-              </a:graphicData>
-            </a:graphic>
-          </wp:inline>
-        </w:drawing>
-      </w:r>
+      <w:r/>
     </w:p>
     <w:p>
       <w:pPr>
@@ -9068,7 +8980,7 @@
         </w:rPr>
       </w:pPr>
       <w:r>
-        <w:t>Рис. 16. Схема анализа корней с блоком N(s)/L(s)</w:t>
+        <w:t>Рис. 17. Схема анализа корней с блоком N(s)/L(s)</w:t>
       </w:r>
     </w:p>
     <w:p>
@@ -9077,46 +8989,7 @@
         <w:spacing w:before="80" w:after="40"/>
         <w:jc w:val="center"/>
       </w:pPr>
-      <w:r>
-        <w:rPr>
-          <w:noProof/>
-        </w:rPr>
-        <w:drawing>
-          <wp:inline distT="0" distB="0" distL="0" distR="0" wp14:anchorId="359E6912" wp14:editId="19319761">
-            <wp:extent cx="4389120" cy="1280793"/>
-            <wp:effectExtent l="0" t="0" r="0" b="0"/>
-            <wp:docPr id="17" name="Picture 17"/>
-            <wp:cNvGraphicFramePr>
-              <a:graphicFrameLocks xmlns:a="http://schemas.openxmlformats.org/drawingml/2006/main" noChangeAspect="1"/>
-            </wp:cNvGraphicFramePr>
-            <a:graphic xmlns:a="http://schemas.openxmlformats.org/drawingml/2006/main">
-              <a:graphicData uri="http://schemas.openxmlformats.org/drawingml/2006/picture">
-                <pic:pic xmlns:pic="http://schemas.openxmlformats.org/drawingml/2006/picture">
-                  <pic:nvPicPr>
-                    <pic:cNvPr id="0" name="img_07.png"/>
-                    <pic:cNvPicPr/>
-                  </pic:nvPicPr>
-                  <pic:blipFill>
-                    <a:blip r:embed="rId24"/>
-                    <a:stretch>
-                      <a:fillRect/>
-                    </a:stretch>
-                  </pic:blipFill>
-                  <pic:spPr>
-                    <a:xfrm>
-                      <a:off x="0" y="0"/>
-                      <a:ext cx="4389120" cy="1280793"/>
-                    </a:xfrm>
-                    <a:prstGeom prst="rect">
-                      <a:avLst/>
-                    </a:prstGeom>
-                  </pic:spPr>
-                </pic:pic>
-              </a:graphicData>
-            </a:graphic>
-          </wp:inline>
-        </w:drawing>
-      </w:r>
+      <w:r/>
     </w:p>
     <w:p>
       <w:pPr>
@@ -9127,26 +9000,8 @@
         </w:rPr>
       </w:pPr>
       <w:r>
-        <w:rPr>
-          <w:rFonts w:ascii="Times New Roman" w:hAnsi="Times New Roman"/>
-          <w:i/>
-          <w:color w:val="000000"/>
-          <w:sz w:val="21"/>
-          <w:lang w:val="ru-RU"/>
-        </w:rPr>
-        <w:t xml:space="preserve">Рис. 17. Результаты вычисления нулей, полюсов и матриц состояния системы в </w:t>
-      </w:r>
-      <w:proofErr w:type="spellStart"/>
-      <w:r>
-        <w:rPr>
-          <w:rFonts w:ascii="Times New Roman" w:hAnsi="Times New Roman"/>
-          <w:i/>
-          <w:color w:val="000000"/>
-          <w:sz w:val="21"/>
-        </w:rPr>
-        <w:t>SimInTech</w:t>
-      </w:r>
-      <w:proofErr w:type="spellEnd"/>
+        <w:t>Рис. 18. Результаты вычисления нулей, полюсов и матриц состояния системы в SimInTech</w:t>
+      </w:r>
     </w:p>
     <w:p>
       <w:pPr>
@@ -9158,120 +9013,7 @@
         </w:rPr>
       </w:pPr>
       <w:r>
-        <w:rPr>
-          <w:rFonts w:ascii="Times New Roman" w:hAnsi="Times New Roman"/>
-          <w:color w:val="000000"/>
-          <w:sz w:val="24"/>
-          <w:lang w:val="ru-RU"/>
-        </w:rPr>
-        <w:t xml:space="preserve">Годограф Найквиста (Рис. 15) при предельном коэффициенте усиления проходит вблизи критической точки (-1, </w:t>
-      </w:r>
-      <w:r>
-        <w:rPr>
-          <w:rFonts w:ascii="Times New Roman" w:hAnsi="Times New Roman"/>
-          <w:color w:val="000000"/>
-          <w:sz w:val="24"/>
-        </w:rPr>
-        <w:t>j</w:t>
-      </w:r>
-      <w:r>
-        <w:rPr>
-          <w:rFonts w:ascii="Times New Roman" w:hAnsi="Times New Roman"/>
-          <w:color w:val="000000"/>
-          <w:sz w:val="24"/>
-          <w:lang w:val="ru-RU"/>
-        </w:rPr>
-        <w:t xml:space="preserve">0). Блок идентификации (Рис. 17) зафиксировал правый нуль </w:t>
-      </w:r>
-      <w:r>
-        <w:rPr>
-          <w:rFonts w:ascii="Times New Roman" w:hAnsi="Times New Roman"/>
-          <w:color w:val="000000"/>
-          <w:sz w:val="24"/>
-        </w:rPr>
-        <w:t>Zeros</w:t>
-      </w:r>
-      <w:r>
-        <w:rPr>
-          <w:rFonts w:ascii="Times New Roman" w:hAnsi="Times New Roman"/>
-          <w:color w:val="000000"/>
-          <w:sz w:val="24"/>
-          <w:lang w:val="ru-RU"/>
-        </w:rPr>
-        <w:t xml:space="preserve"> = +6.25 с⁻¹ (свойство </w:t>
-      </w:r>
-      <w:proofErr w:type="spellStart"/>
-      <w:r>
-        <w:rPr>
-          <w:rFonts w:ascii="Times New Roman" w:hAnsi="Times New Roman"/>
-          <w:color w:val="000000"/>
-          <w:sz w:val="24"/>
-          <w:lang w:val="ru-RU"/>
-        </w:rPr>
-        <w:t>неминимальной</w:t>
-      </w:r>
-      <w:proofErr w:type="spellEnd"/>
-      <w:r>
-        <w:rPr>
-          <w:rFonts w:ascii="Times New Roman" w:hAnsi="Times New Roman"/>
-          <w:color w:val="000000"/>
-          <w:sz w:val="24"/>
-          <w:lang w:val="ru-RU"/>
-        </w:rPr>
-        <w:t xml:space="preserve"> фазы) и чисто мнимые полюса </w:t>
-      </w:r>
-      <w:proofErr w:type="spellStart"/>
-      <w:r>
-        <w:rPr>
-          <w:rFonts w:ascii="Times New Roman" w:hAnsi="Times New Roman"/>
-          <w:color w:val="000000"/>
-          <w:sz w:val="24"/>
-        </w:rPr>
-        <w:t>Poluses</w:t>
-      </w:r>
-      <w:proofErr w:type="spellEnd"/>
-      <w:r>
-        <w:rPr>
-          <w:rFonts w:ascii="Times New Roman" w:hAnsi="Times New Roman"/>
-          <w:color w:val="000000"/>
-          <w:sz w:val="24"/>
-          <w:lang w:val="ru-RU"/>
-        </w:rPr>
-        <w:t xml:space="preserve"> = -0.04 ± 9.16</w:t>
-      </w:r>
-      <w:r>
-        <w:rPr>
-          <w:rFonts w:ascii="Times New Roman" w:hAnsi="Times New Roman"/>
-          <w:color w:val="000000"/>
-          <w:sz w:val="24"/>
-        </w:rPr>
-        <w:t>j</w:t>
-      </w:r>
-      <w:r>
-        <w:rPr>
-          <w:rFonts w:ascii="Times New Roman" w:hAnsi="Times New Roman"/>
-          <w:color w:val="000000"/>
-          <w:sz w:val="24"/>
-          <w:lang w:val="ru-RU"/>
-        </w:rPr>
-        <w:t xml:space="preserve"> с⁻¹, что с точностью до шага совпадает с расчетной аналитической частотой автоколебаний </w:t>
-      </w:r>
-      <w:r>
-        <w:rPr>
-          <w:rFonts w:ascii="Times New Roman" w:hAnsi="Times New Roman"/>
-          <w:color w:val="000000"/>
-          <w:sz w:val="24"/>
-        </w:rPr>
-        <w:t>ω</w:t>
-      </w:r>
-      <w:r>
-        <w:rPr>
-          <w:rFonts w:ascii="Times New Roman" w:hAnsi="Times New Roman"/>
-          <w:color w:val="000000"/>
-          <w:sz w:val="24"/>
-          <w:lang w:val="ru-RU"/>
-        </w:rPr>
-        <w:t>₀ ≈ 9.25 рад/с.</w:t>
+        <w:t>Годограф Найквиста (Рис. 16) при предельном коэффициенте усиления проходит вблизи критической точки (-1, j0). Блок идентификации (Рис. 18) зафиксировал правый нуль Zeros = +6.25 с⁻¹ (свойство неминимальной фазы) и чисто мнимые полюса Poluses = -0.04 ± 9.16j с⁻¹, что с точностью до шага совпадает с расчетной аналитической частотой автоколебаний ω₀ ≈ 9.25 рад/с.</w:t>
       </w:r>
     </w:p>
     <w:p>
@@ -9283,13 +9025,6 @@
         </w:rPr>
       </w:pPr>
       <w:r>
-        <w:rPr>
-          <w:rFonts w:ascii="Times New Roman" w:hAnsi="Times New Roman"/>
-          <w:b/>
-          <w:color w:val="000000"/>
-          <w:sz w:val="26"/>
-          <w:lang w:val="ru-RU"/>
-        </w:rPr>
         <w:t>5. Выводы</w:t>
       </w:r>
     </w:p>
@@ -9303,32 +9038,7 @@
         </w:rPr>
       </w:pPr>
       <w:r>
-        <w:rPr>
-          <w:rFonts w:ascii="Times New Roman" w:hAnsi="Times New Roman"/>
-          <w:color w:val="000000"/>
-          <w:sz w:val="24"/>
-          <w:lang w:val="ru-RU"/>
-        </w:rPr>
-        <w:t xml:space="preserve">• 1. В среде </w:t>
-      </w:r>
-      <w:proofErr w:type="spellStart"/>
-      <w:r>
-        <w:rPr>
-          <w:rFonts w:ascii="Times New Roman" w:hAnsi="Times New Roman"/>
-          <w:color w:val="000000"/>
-          <w:sz w:val="24"/>
-        </w:rPr>
-        <w:t>SimInTech</w:t>
-      </w:r>
-      <w:proofErr w:type="spellEnd"/>
-      <w:r>
-        <w:rPr>
-          <w:rFonts w:ascii="Times New Roman" w:hAnsi="Times New Roman"/>
-          <w:color w:val="000000"/>
-          <w:sz w:val="24"/>
-          <w:lang w:val="ru-RU"/>
-        </w:rPr>
-        <w:t xml:space="preserve"> построены и исследованы модели многосвязной системы пятого порядка на базе передаточных функций и в пространстве состояний.</w:t>
+        <w:t>• 1. В среде SimInTech построены и исследованы модели многосвязной системы пятого порядка на базе передаточных функций и в пространстве состояний.</w:t>
       </w:r>
     </w:p>
     <w:p>
@@ -9341,81 +9051,7 @@
         </w:rPr>
       </w:pPr>
       <w:r>
-        <w:rPr>
-          <w:rFonts w:ascii="Times New Roman" w:hAnsi="Times New Roman"/>
-          <w:color w:val="000000"/>
-          <w:sz w:val="24"/>
-          <w:lang w:val="ru-RU"/>
-        </w:rPr>
-        <w:t xml:space="preserve">• 2. Метод уравнения замыкания позволил исключить операцию дифференцирования входного сигнала </w:t>
-      </w:r>
-      <w:r>
-        <w:rPr>
-          <w:rFonts w:ascii="Times New Roman" w:hAnsi="Times New Roman"/>
-          <w:color w:val="000000"/>
-          <w:sz w:val="24"/>
-        </w:rPr>
-        <w:t>u</w:t>
-      </w:r>
-      <w:r>
-        <w:rPr>
-          <w:rFonts w:ascii="Times New Roman" w:hAnsi="Times New Roman"/>
-          <w:color w:val="000000"/>
-          <w:sz w:val="24"/>
-          <w:lang w:val="ru-RU"/>
-        </w:rPr>
-        <w:t xml:space="preserve">₁ в звене </w:t>
-      </w:r>
-      <w:r>
-        <w:rPr>
-          <w:rFonts w:ascii="Times New Roman" w:hAnsi="Times New Roman"/>
-          <w:color w:val="000000"/>
-          <w:sz w:val="24"/>
-        </w:rPr>
-        <w:t>W</w:t>
-      </w:r>
-      <w:r>
-        <w:rPr>
-          <w:rFonts w:ascii="Times New Roman" w:hAnsi="Times New Roman"/>
-          <w:color w:val="000000"/>
-          <w:sz w:val="24"/>
-          <w:lang w:val="ru-RU"/>
-        </w:rPr>
-        <w:t>₃(</w:t>
-      </w:r>
-      <w:r>
-        <w:rPr>
-          <w:rFonts w:ascii="Times New Roman" w:hAnsi="Times New Roman"/>
-          <w:color w:val="000000"/>
-          <w:sz w:val="24"/>
-        </w:rPr>
-        <w:t>p</w:t>
-      </w:r>
-      <w:r>
-        <w:rPr>
-          <w:rFonts w:ascii="Times New Roman" w:hAnsi="Times New Roman"/>
-          <w:color w:val="000000"/>
-          <w:sz w:val="24"/>
-          <w:lang w:val="ru-RU"/>
-        </w:rPr>
-        <w:t xml:space="preserve">), сформировав прямое безынерционное прохождение сигнала </w:t>
-      </w:r>
-      <w:r>
-        <w:rPr>
-          <w:rFonts w:ascii="Times New Roman" w:hAnsi="Times New Roman"/>
-          <w:color w:val="000000"/>
-          <w:sz w:val="24"/>
-        </w:rPr>
-        <w:t>D</w:t>
-      </w:r>
-      <w:r>
-        <w:rPr>
-          <w:rFonts w:ascii="Times New Roman" w:hAnsi="Times New Roman"/>
-          <w:color w:val="000000"/>
-          <w:sz w:val="24"/>
-          <w:lang w:val="ru-RU"/>
-        </w:rPr>
-        <w:t>₂₁ = 4.8.</w:t>
+        <w:t>• 2. Метод уравнения замыкания позволил исключить операцию дифференцирования входного сигнала u₁ в звене W₃(p), сформировав прямое безынерционное прохождение сигнала D₂₁ = 4.8.</w:t>
       </w:r>
     </w:p>
     <w:p>
@@ -9428,12 +9064,6 @@
         </w:rPr>
       </w:pPr>
       <w:r>
-        <w:rPr>
-          <w:rFonts w:ascii="Times New Roman" w:hAnsi="Times New Roman"/>
-          <w:color w:val="000000"/>
-          <w:sz w:val="24"/>
-          <w:lang w:val="ru-RU"/>
-        </w:rPr>
         <w:t>• 3. Выходы моделей на передаточных функциях и в пространстве состояний полностью совпадают во всем временном интервале, подтверждая корректность аналитического вывода матриц Коши.</w:t>
       </w:r>
     </w:p>

</xml_diff>

<commit_message>
fix(lr2): replace Stodola terminology with standard Hurwitz stability criterion
</commit_message>
<xml_diff>
--- a/МСУ/ЛР2/Отчет_ЛР2_Грудинин_Огарков.docx
+++ b/МСУ/ЛР2/Отчет_ЛР2_Грудинин_Огарков.docx
@@ -5812,30 +5812,7 @@
         </w:rPr>
       </w:pPr>
       <w:r>
-        <w:rPr>
-          <w:rFonts w:ascii="Times New Roman" w:hAnsi="Times New Roman"/>
-          <w:color w:val="000000"/>
-          <w:sz w:val="24"/>
-          <w:lang w:val="ru-RU"/>
-        </w:rPr>
-        <w:t xml:space="preserve">По критерию Стодолы–Гурвица условие границы устойчивости соответствует равенству нулю коэффициента при </w:t>
-      </w:r>
-      <w:r>
-        <w:rPr>
-          <w:rFonts w:ascii="Times New Roman" w:hAnsi="Times New Roman"/>
-          <w:color w:val="000000"/>
-          <w:sz w:val="24"/>
-        </w:rPr>
-        <w:t>p</w:t>
-      </w:r>
-      <w:r>
-        <w:rPr>
-          <w:rFonts w:ascii="Times New Roman" w:hAnsi="Times New Roman"/>
-          <w:color w:val="000000"/>
-          <w:sz w:val="24"/>
-          <w:lang w:val="ru-RU"/>
-        </w:rPr>
-        <w:t>:</w:t>
+        <w:t>По критерию Гурвица условие границы устойчивости соответствует равенству нулю коэффициента при p:</w:t>
       </w:r>
     </w:p>
     <w:p>
@@ -9090,7 +9067,7 @@
         </w:rPr>
       </w:pPr>
       <w:r>
-        <w:t>• 5. Аналитический расчет предельного коэффициента усиления по критерию Стодолы–Гурвица (k_пред = 16.125) подтвержден численным экспериментом: при K = 14 система устойчива (переходный процесс затухает), при K = 18 неустойчива (амплитуда колебаний нарастает), а на границе возникают незатухающие синусоидальные автоколебания с расчетной частотой около 9.25 рад/с. Полученные результаты согласуются с частотным критерием Найквиста и расчетом корней в SimInTech.</w:t>
+        <w:t>• 5. Аналитический расчет предельного коэффициента усиления по критерию Гурвица (k_пред = 16.125) подтвержден численным экспериментом: при K = 14 система устойчива (переходный процесс затухает), при K = 18 неустойчива (амплитуда колебаний нарастает), а на границе возникают незатухающие синусоидальные автоколебания с расчетной частотой около 9.25 рад/с. Полученные результаты согласуются с частотным критерием Найквиста и расчетом корней в SimInTech.</w:t>
       </w:r>
     </w:p>
     <w:sectPr>

</xml_diff>